<commit_message>
Update README and self-TODO doc: Excel gap closed, final status table
Reflects that real .xlsx workbooks now exist for ЛР1/4/5/6, and
summarizes the council-audit-and-fix pass across all six labs.
</commit_message>
<xml_diff>
--- a/ЧТО_ДОСНЯТЬ_САМОЙ.docx
+++ b/ЧТО_ДОСНЯТЬ_САМОЙ.docx
@@ -414,33 +414,15 @@
         <w:spacing w:after="120" w:before="240"/>
       </w:pPr>
       <w:r>
-        <w:t xml:space="preserve">4. Что не было сделано полностью — Excel-шаблоны методик</w:t>
-      </w:r>
-    </w:p>
-    <w:p>
-      <w:pPr>
-        <w:spacing w:after="120"/>
-      </w:pPr>
-      <w:r>
-        <w:t xml:space="preserve">Часть методичек (особенно ЛР5 — модель Левитта-Кано, ЛР4 — SimilarWeb-скоринг, ЛР6 — 5 шаблонов) прилагает отдельные Excel-файлы с многолистовой структурой (дашборды, банки анализа, паспорта). Все содержательные результаты этих шаблонов перенесены в текстовые отчёты (</w:t>
-      </w:r>
-      <w:r>
-        <w:rPr>
-          <w:rFonts w:ascii="Consolas" w:cs="Consolas" w:eastAsia="Consolas" w:hAnsi="Consolas"/>
-        </w:rPr>
-        <w:t xml:space="preserve">.md</w:t>
-      </w:r>
-      <w:r>
-        <w:t xml:space="preserve">/</w:t>
-      </w:r>
-      <w:r>
-        <w:rPr>
-          <w:rFonts w:ascii="Consolas" w:cs="Consolas" w:eastAsia="Consolas" w:hAnsi="Consolas"/>
-        </w:rPr>
-        <w:t xml:space="preserve">.docx</w:t>
-      </w:r>
-      <w:r>
-        <w:t xml:space="preserve">) с той же логикой и теми же реальными данными — но сами файлы </w:t>
+        <w:t xml:space="preserve">4. Excel-шаблоны методик — статус</w:t>
+      </w:r>
+    </w:p>
+    <w:p>
+      <w:pPr>
+        <w:spacing w:after="120"/>
+      </w:pPr>
+      <w:r>
+        <w:t xml:space="preserve">Реальные </w:t>
       </w:r>
       <w:r>
         <w:rPr>
@@ -449,7 +431,58 @@
         <w:t xml:space="preserve">.xlsx</w:t>
       </w:r>
       <w:r>
-        <w:t xml:space="preserve"> с формулами и многолистовой структурой не воспроизведены один в один по всем листам каждого шаблона (это отдельный большой объём работы сверх текстового анализа). Если для сдачи нужны именно заполненные </w:t>
+        <w:t xml:space="preserve">-файлы с формулами (не просто текст) созданы для всех четырёх лабораторных, где методика их требует: - </w:t>
+      </w:r>
+      <w:r>
+        <w:rPr>
+          <w:rFonts w:ascii="Consolas" w:cs="Consolas" w:eastAsia="Consolas" w:hAnsi="Consolas"/>
+        </w:rPr>
+        <w:t xml:space="preserve">labs/lab1-demand/ЛР1_Тренд_Сезонность_DiagramCode.xlsx</w:t>
+      </w:r>
+      <w:r>
+        <w:t xml:space="preserve"> — 40 месяцев реальных данных Google Trends, формулы скользящего среднего, YoY-роста, сезонного индекса по месяцам. - </w:t>
+      </w:r>
+      <w:r>
+        <w:rPr>
+          <w:rFonts w:ascii="Consolas" w:cs="Consolas" w:eastAsia="Consolas" w:hAnsi="Consolas"/>
+        </w:rPr>
+        <w:t xml:space="preserve">labs/lab4-porter/ЛР4_Портер_SimilarWeb_DiagramCode.xlsx</w:t>
+      </w:r>
+      <w:r>
+        <w:t xml:space="preserve"> — матрица 5 сил и барьеров с формулами AVERAGE(). - </w:t>
+      </w:r>
+      <w:r>
+        <w:rPr>
+          <w:rFonts w:ascii="Consolas" w:cs="Consolas" w:eastAsia="Consolas" w:hAnsi="Consolas"/>
+        </w:rPr>
+        <w:t xml:space="preserve">labs/lab5-competitors/ЛР5_Классификация_Левитт_Кано_DiagramCode.xlsx</w:t>
+      </w:r>
+      <w:r>
+        <w:t xml:space="preserve"> — формула классификации на живых SUMPRODUCT/IF, модели Левитта и Кано. - </w:t>
+      </w:r>
+      <w:r>
+        <w:rPr>
+          <w:rFonts w:ascii="Consolas" w:cs="Consolas" w:eastAsia="Consolas" w:hAnsi="Consolas"/>
+        </w:rPr>
+        <w:t xml:space="preserve">labs/lab6-canvas-releases/ЛР6_Канвас_Сценарии_Релизы_DiagramCode.xlsx</w:t>
+      </w:r>
+      <w:r>
+        <w:t xml:space="preserve"> — один консолидированный файл на все 5 требуемых шаблонов.</w:t>
+      </w:r>
+    </w:p>
+    <w:p>
+      <w:pPr>
+        <w:spacing w:after="120"/>
+      </w:pPr>
+      <w:r>
+        <w:rPr>
+          <w:b/>
+          <w:bCs/>
+        </w:rPr>
+        <w:t xml:space="preserve">Оговорка</w:t>
+      </w:r>
+      <w:r>
+        <w:t xml:space="preserve">: это не побайтовая копия каждого листа из оригинальных многолистовых шаблонов курса (там встречаются доп. листы вроде «Дашборд» с десятками ячеек, «Банк анализа» и т.п.) — а компактные рабочие файлы с той же логикой, реальными данными и настоящими формулами. Если для сдачи нужна точная структура листов оригинальных </w:t>
       </w:r>
       <w:r>
         <w:rPr>
@@ -458,7 +491,7 @@
         <w:t xml:space="preserve">.xlsx</w:t>
       </w:r>
       <w:r>
-        <w:t xml:space="preserve">-файлы по каждому листу шаблона — скажите, это можно сделать отдельным приоритетным заходом.</w:t>
+        <w:t xml:space="preserve">-шаблонов один в один — скажите, доработаю под конкретный шаблон.</w:t>
       </w:r>
     </w:p>
     <w:p>

</xml_diff>